<commit_message>
feat: definitivos/preliminares, garantia pagare/pagare+garantia, validaciones y fechas sec 5.4
- tipo_pliego: selector definitivos/preliminares actualiza titulo y menciones en el cuerpo
- garantia_cumplimiento_tipo: toggle pagare/pagare+garantia elimina/conserva seccion
  'Adicionalmente...' en 8.1, 8.2 y minuta de oferta (4 bloques marcados)
- Seccion 5.4: segunda mencion de fecha limite de oferta ahora reemplazada ({{fecha_limite_oferta_hora}})
- mes_publicacion: usa fecha actual (datetime.now) en lugar de fecha SICEP
- Validacion frontend: productos deben estar dentro del periodo del contrato
- TOC: actualizacion automatica via win32com si Word esta disponible
- plantilla_base.docx regenerada con todos los nuevos marcadores

Co-Authored-By: Claude Sonnet 4.6 <noreply@anthropic.com>
</commit_message>
<xml_diff>
--- a/pliego-tool/templates/plantilla_base.docx
+++ b/pliego-tool/templates/plantilla_base.docx
@@ -456,7 +456,7 @@
           <w:szCs w:val="24"/>
           <w:rtl w:val="0"/>
         </w:rPr>
-        <w:t xml:space="preserve">PLIEGO DE CONDICIONES DEFINITIVOS</w:t>
+        <w:t>PLIEGO DE CONDICIONES {{tipo_pliego_upper}}</w:t>
       </w:r>
     </w:p>
     <w:p>
@@ -12488,16 +12488,15 @@
           <w:szCs w:val="24"/>
           <w:rtl w:val="0"/>
         </w:rPr>
-        <w:t xml:space="preserve">L</w:t>
-      </w:r>
-      <w:r>
-        <w:rPr>
-          <w:rFonts w:ascii="Cambria" w:cs="Cambria" w:eastAsia="Cambria" w:hAnsi="Cambria"/>
-          <w:sz w:val="24"/>
-          <w:szCs w:val="24"/>
-          <w:rtl w:val="0"/>
-        </w:rPr>
-        <w:t xml:space="preserve">os documentos que acrediten el cumplimiento de requisitos habilitantes y las OFERTAS</w:t>
+        <w:t>Los documentos que acrediten el cumplimiento de requisitos habilitantes y las OFERTAS deberán ser registradas por los agentes en el SICEP, a más tardar a las {{fecha_limite_oferta_hora}}.</w:t>
+      </w:r>
+      <w:r>
+        <w:rPr>
+          <w:rFonts w:ascii="Cambria" w:cs="Cambria" w:eastAsia="Cambria" w:hAnsi="Cambria"/>
+          <w:sz w:val="24"/>
+          <w:szCs w:val="24"/>
+          <w:rtl w:val="0"/>
+        </w:rPr>
       </w:r>
       <w:r>
         <w:rPr>
@@ -12507,16 +12506,14 @@
           <w:szCs w:val="24"/>
           <w:rtl w:val="0"/>
         </w:rPr>
-        <w:t xml:space="preserve"> deberán ser registradas por los agentes en el SICEP, a más tardar a las 17:00 horas del </w:t>
-      </w:r>
-      <w:r>
-        <w:rPr>
-          <w:rFonts w:ascii="Cambria" w:cs="Cambria" w:eastAsia="Cambria" w:hAnsi="Cambria"/>
-          <w:sz w:val="24"/>
-          <w:szCs w:val="24"/>
-          <w:rtl w:val="0"/>
-        </w:rPr>
-        <w:t xml:space="preserve">20 de mayo de 2026</w:t>
+      </w:r>
+      <w:r>
+        <w:rPr>
+          <w:rFonts w:ascii="Cambria" w:cs="Cambria" w:eastAsia="Cambria" w:hAnsi="Cambria"/>
+          <w:sz w:val="24"/>
+          <w:szCs w:val="24"/>
+          <w:rtl w:val="0"/>
+        </w:rPr>
       </w:r>
       <w:r>
         <w:rPr>
@@ -12526,7 +12523,6 @@
           <w:szCs w:val="24"/>
           <w:rtl w:val="0"/>
         </w:rPr>
-        <w:t xml:space="preserve">.</w:t>
       </w:r>
     </w:p>
     <w:p>
@@ -15016,6 +15012,11 @@
       </w:r>
     </w:p>
     <w:p>
+      <w:r>
+        <w:t>{{garantia_extra_vendedor_inicio}}</w:t>
+      </w:r>
+    </w:p>
+    <w:p>
       <w:pPr>
         <w:widowControl w:val="0"/>
         <w:spacing w:after="0" w:before="228" w:line="240" w:lineRule="auto"/>
@@ -15416,6 +15417,11 @@
         <w:rPr>
           <w:rtl w:val="0"/>
         </w:rPr>
+      </w:r>
+    </w:p>
+    <w:p>
+      <w:r>
+        <w:t>{{garantia_extra_vendedor_fin}}</w:t>
       </w:r>
     </w:p>
     <w:p>
@@ -15546,6 +15552,11 @@
       </w:r>
     </w:p>
     <w:p>
+      <w:r>
+        <w:t>{{garantia_extra_comprador_inicio}}</w:t>
+      </w:r>
+    </w:p>
+    <w:p>
       <w:pPr>
         <w:spacing w:after="0" w:line="240" w:lineRule="auto"/>
         <w:ind w:left="-90" w:firstLine="0"/>
@@ -16012,6 +16023,11 @@
         <w:rPr>
           <w:rtl w:val="0"/>
         </w:rPr>
+      </w:r>
+    </w:p>
+    <w:p>
+      <w:r>
+        <w:t>{{garantia_extra_comprador_fin}}</w:t>
       </w:r>
     </w:p>
     <w:p>
@@ -19476,6 +19492,11 @@
       </w:r>
     </w:p>
     <w:p>
+      <w:r>
+        <w:t>{{garantia_extra_vendedor_minuta_inicio}}</w:t>
+      </w:r>
+    </w:p>
+    <w:p>
       <w:pPr>
         <w:widowControl w:val="0"/>
         <w:spacing w:after="0" w:before="228" w:line="240" w:lineRule="auto"/>
@@ -19860,6 +19881,11 @@
       </w:r>
     </w:p>
     <w:p>
+      <w:r>
+        <w:t>{{garantia_extra_vendedor_minuta_fin}}</w:t>
+      </w:r>
+    </w:p>
+    <w:p>
       <w:pPr>
         <w:widowControl w:val="0"/>
         <w:shd w:fill="ffffff" w:val="clear"/>
@@ -19965,6 +19991,11 @@
       </w:r>
     </w:p>
     <w:p>
+      <w:r>
+        <w:t>{{garantia_extra_comprador_minuta_inicio}}</w:t>
+      </w:r>
+    </w:p>
+    <w:p>
       <w:pPr>
         <w:spacing w:after="0" w:line="240" w:lineRule="auto"/>
         <w:ind w:left="-90" w:firstLine="0"/>
@@ -20521,6 +20552,11 @@
           <w:rtl w:val="0"/>
         </w:rPr>
         <w:t xml:space="preserve">Adicionalmente, se deberá publicar un aviso en diario de circulación nacional informando sobre el extravío, hurto o destrucción total o parcial del título. Transcurridos diez (10) días desde la fecha de publicación del aviso, si no se presenta oposición de terceros comunicada por escrito ante la entidad o persona emisora, aceptante o giradora, esta podrá tener por cancelado el título y, si es del caso, pagarlo o reponer el documento. En ningún caso, podrán exigirse condiciones adicionales. </w:t>
+      </w:r>
+    </w:p>
+    <w:p>
+      <w:r>
+        <w:t>{{garantia_extra_comprador_minuta_fin}}</w:t>
       </w:r>
     </w:p>
     <w:p>
@@ -22233,7 +22269,7 @@
           <w:szCs w:val="24"/>
           <w:rtl w:val="0"/>
         </w:rPr>
-        <w:t xml:space="preserve">Cualquier aspecto no contemplado expresamente en la presente oferta, se regirá en su integridad por lo previsto en los Pliegos de Condiciones definitivos de la Invitación a Ofrecer de la referencia.</w:t>
+        <w:t>Cualquier aspecto no contemplado expresamente en la presente oferta, se regirá en su integridad por lo previsto en los Pliegos de Condiciones {{tipo_pliego_cap}} de la Invitación a Ofrecer de la referencia.</w:t>
       </w:r>
     </w:p>
     <w:p>

</xml_diff>

<commit_message>
fix: fecha parrafo 5.4, warning cobertura de periodo, toast amber
- crear_plantilla: nueva reemplazo 'a mas tardar el 20 de mayo de 2026' (parrafo [218] seccion 5.4)
- generator: marcador {{fecha_limite_oferta_dia}} (solo fecha, sin hora) para ese parrafo
- index: verificarCoberturaProductos() detecta periodos sin cubrir y muestra warning
  no bloqueante en color ambar al pasar al paso 4

Co-Authored-By: Claude Sonnet 4.6 <noreply@anthropic.com>
</commit_message>
<xml_diff>
--- a/pliego-tool/templates/plantilla_base.docx
+++ b/pliego-tool/templates/plantilla_base.docx
@@ -12214,7 +12214,7 @@
           <w:szCs w:val="24"/>
           <w:rtl w:val="0"/>
         </w:rPr>
-        <w:t xml:space="preserve">Sin perjuicio de lo anterior, todos </w:t>
+        <w:t>Sin perjuicio de lo anterior, todos los documentos que se encuentren suscritos por el representante legal o apoderado deberán contar con firma digital de Certicámara o certificada por alguna entidad de Certificación Digital registrada ante el Organismo Nacional de Acreditación de Colombia; en caso de no contar con firma digital, la garantía de seriedad deberá ser remitida a más tardar el {{fecha_limite_oferta_dia}} en original con firma manuscrita por correo certificado a la dirección: Calle 103 # 18a-48 piso 3, Edificio Los Coches, Bogotá, D.C., a la atención de Juliana Bonilla. En SICEP deberá cargarse copia de la garantía de seriedad y comprobante de envío del original.</w:t>
       </w:r>
       <w:r>
         <w:rPr>
@@ -12224,16 +12224,14 @@
           <w:szCs w:val="24"/>
           <w:rtl w:val="0"/>
         </w:rPr>
-        <w:t xml:space="preserve">los documentos que se encuentren suscritos por el representante legal o apoderado deberán contar con firma digital de </w:t>
-      </w:r>
-      <w:r>
-        <w:rPr>
-          <w:rFonts w:ascii="Cambria" w:cs="Cambria" w:eastAsia="Cambria" w:hAnsi="Cambria"/>
-          <w:sz w:val="24"/>
-          <w:szCs w:val="24"/>
-          <w:rtl w:val="0"/>
-        </w:rPr>
-        <w:t xml:space="preserve">C</w:t>
+      </w:r>
+      <w:r>
+        <w:rPr>
+          <w:rFonts w:ascii="Cambria" w:cs="Cambria" w:eastAsia="Cambria" w:hAnsi="Cambria"/>
+          <w:sz w:val="24"/>
+          <w:szCs w:val="24"/>
+          <w:rtl w:val="0"/>
+        </w:rPr>
       </w:r>
       <w:r>
         <w:rPr>
@@ -12243,16 +12241,14 @@
           <w:szCs w:val="24"/>
           <w:rtl w:val="0"/>
         </w:rPr>
-        <w:t xml:space="preserve">erticámara </w:t>
-      </w:r>
-      <w:r>
-        <w:rPr>
-          <w:rFonts w:ascii="Cambria" w:cs="Cambria" w:eastAsia="Cambria" w:hAnsi="Cambria"/>
-          <w:sz w:val="24"/>
-          <w:szCs w:val="24"/>
-          <w:rtl w:val="0"/>
-        </w:rPr>
-        <w:t xml:space="preserve">o certificada por alguna entidad de Certificación Digital registrada ante el Organismo Nacional de Acreditación de Colombia</w:t>
+      </w:r>
+      <w:r>
+        <w:rPr>
+          <w:rFonts w:ascii="Cambria" w:cs="Cambria" w:eastAsia="Cambria" w:hAnsi="Cambria"/>
+          <w:sz w:val="24"/>
+          <w:szCs w:val="24"/>
+          <w:rtl w:val="0"/>
+        </w:rPr>
       </w:r>
       <w:r>
         <w:rPr>
@@ -12262,16 +12258,14 @@
           <w:szCs w:val="24"/>
           <w:rtl w:val="0"/>
         </w:rPr>
-        <w:t xml:space="preserve">; en caso de no contar con firma digital, la garantía de seriedad deberá ser remitida a m</w:t>
-      </w:r>
-      <w:r>
-        <w:rPr>
-          <w:rFonts w:ascii="Cambria" w:cs="Cambria" w:eastAsia="Cambria" w:hAnsi="Cambria"/>
-          <w:sz w:val="24"/>
-          <w:szCs w:val="24"/>
-          <w:rtl w:val="0"/>
-        </w:rPr>
-        <w:t xml:space="preserve">ás tardar el 20 de mayo de 2026 </w:t>
+      </w:r>
+      <w:r>
+        <w:rPr>
+          <w:rFonts w:ascii="Cambria" w:cs="Cambria" w:eastAsia="Cambria" w:hAnsi="Cambria"/>
+          <w:sz w:val="24"/>
+          <w:szCs w:val="24"/>
+          <w:rtl w:val="0"/>
+        </w:rPr>
       </w:r>
       <w:r>
         <w:rPr>
@@ -12281,16 +12275,14 @@
           <w:szCs w:val="24"/>
           <w:rtl w:val="0"/>
         </w:rPr>
-        <w:t xml:space="preserve">en original </w:t>
-      </w:r>
-      <w:r>
-        <w:rPr>
-          <w:rFonts w:ascii="Cambria" w:cs="Cambria" w:eastAsia="Cambria" w:hAnsi="Cambria"/>
-          <w:sz w:val="24"/>
-          <w:szCs w:val="24"/>
-          <w:rtl w:val="0"/>
-        </w:rPr>
-        <w:t xml:space="preserve">con firma manuscrita </w:t>
+      </w:r>
+      <w:r>
+        <w:rPr>
+          <w:rFonts w:ascii="Cambria" w:cs="Cambria" w:eastAsia="Cambria" w:hAnsi="Cambria"/>
+          <w:sz w:val="24"/>
+          <w:szCs w:val="24"/>
+          <w:rtl w:val="0"/>
+        </w:rPr>
       </w:r>
       <w:r>
         <w:rPr>
@@ -12300,16 +12292,14 @@
           <w:szCs w:val="24"/>
           <w:rtl w:val="0"/>
         </w:rPr>
-        <w:t xml:space="preserve">por correo certificado a la dirección: </w:t>
-      </w:r>
-      <w:r>
-        <w:rPr>
-          <w:rFonts w:ascii="Cambria" w:cs="Cambria" w:eastAsia="Cambria" w:hAnsi="Cambria"/>
-          <w:sz w:val="24"/>
-          <w:szCs w:val="24"/>
-          <w:rtl w:val="0"/>
-        </w:rPr>
-        <w:t xml:space="preserve">Calle</w:t>
+      </w:r>
+      <w:r>
+        <w:rPr>
+          <w:rFonts w:ascii="Cambria" w:cs="Cambria" w:eastAsia="Cambria" w:hAnsi="Cambria"/>
+          <w:sz w:val="24"/>
+          <w:szCs w:val="24"/>
+          <w:rtl w:val="0"/>
+        </w:rPr>
       </w:r>
       <w:r>
         <w:rPr>
@@ -12319,16 +12309,14 @@
           <w:szCs w:val="24"/>
           <w:rtl w:val="0"/>
         </w:rPr>
-        <w:t xml:space="preserve"> 103 # 1</w:t>
-      </w:r>
-      <w:r>
-        <w:rPr>
-          <w:rFonts w:ascii="Cambria" w:cs="Cambria" w:eastAsia="Cambria" w:hAnsi="Cambria"/>
-          <w:sz w:val="24"/>
-          <w:szCs w:val="24"/>
-          <w:rtl w:val="0"/>
-        </w:rPr>
-        <w:t xml:space="preserve">8a</w:t>
+      </w:r>
+      <w:r>
+        <w:rPr>
+          <w:rFonts w:ascii="Cambria" w:cs="Cambria" w:eastAsia="Cambria" w:hAnsi="Cambria"/>
+          <w:sz w:val="24"/>
+          <w:szCs w:val="24"/>
+          <w:rtl w:val="0"/>
+        </w:rPr>
       </w:r>
       <w:r>
         <w:rPr>
@@ -12338,16 +12326,14 @@
           <w:szCs w:val="24"/>
           <w:rtl w:val="0"/>
         </w:rPr>
-        <w:t xml:space="preserve">-</w:t>
-      </w:r>
-      <w:r>
-        <w:rPr>
-          <w:rFonts w:ascii="Cambria" w:cs="Cambria" w:eastAsia="Cambria" w:hAnsi="Cambria"/>
-          <w:sz w:val="24"/>
-          <w:szCs w:val="24"/>
-          <w:rtl w:val="0"/>
-        </w:rPr>
-        <w:t xml:space="preserve">48</w:t>
+      </w:r>
+      <w:r>
+        <w:rPr>
+          <w:rFonts w:ascii="Cambria" w:cs="Cambria" w:eastAsia="Cambria" w:hAnsi="Cambria"/>
+          <w:sz w:val="24"/>
+          <w:szCs w:val="24"/>
+          <w:rtl w:val="0"/>
+        </w:rPr>
       </w:r>
       <w:r>
         <w:rPr>
@@ -12357,16 +12343,14 @@
           <w:szCs w:val="24"/>
           <w:rtl w:val="0"/>
         </w:rPr>
-        <w:t xml:space="preserve"> </w:t>
-      </w:r>
-      <w:r>
-        <w:rPr>
-          <w:rFonts w:ascii="Cambria" w:cs="Cambria" w:eastAsia="Cambria" w:hAnsi="Cambria"/>
-          <w:sz w:val="24"/>
-          <w:szCs w:val="24"/>
-          <w:rtl w:val="0"/>
-        </w:rPr>
-        <w:t xml:space="preserve">piso 3</w:t>
+      </w:r>
+      <w:r>
+        <w:rPr>
+          <w:rFonts w:ascii="Cambria" w:cs="Cambria" w:eastAsia="Cambria" w:hAnsi="Cambria"/>
+          <w:sz w:val="24"/>
+          <w:szCs w:val="24"/>
+          <w:rtl w:val="0"/>
+        </w:rPr>
       </w:r>
       <w:r>
         <w:rPr>
@@ -12376,16 +12360,14 @@
           <w:szCs w:val="24"/>
           <w:rtl w:val="0"/>
         </w:rPr>
-        <w:t xml:space="preserve">, Edificio </w:t>
-      </w:r>
-      <w:r>
-        <w:rPr>
-          <w:rFonts w:ascii="Cambria" w:cs="Cambria" w:eastAsia="Cambria" w:hAnsi="Cambria"/>
-          <w:sz w:val="24"/>
-          <w:szCs w:val="24"/>
-          <w:rtl w:val="0"/>
-        </w:rPr>
-        <w:t xml:space="preserve">Los Coches</w:t>
+      </w:r>
+      <w:r>
+        <w:rPr>
+          <w:rFonts w:ascii="Cambria" w:cs="Cambria" w:eastAsia="Cambria" w:hAnsi="Cambria"/>
+          <w:sz w:val="24"/>
+          <w:szCs w:val="24"/>
+          <w:rtl w:val="0"/>
+        </w:rPr>
       </w:r>
       <w:r>
         <w:rPr>
@@ -12395,16 +12377,14 @@
           <w:szCs w:val="24"/>
           <w:rtl w:val="0"/>
         </w:rPr>
-        <w:t xml:space="preserve">, Bogotá, D.C., a la atención de </w:t>
-      </w:r>
-      <w:r>
-        <w:rPr>
-          <w:rFonts w:ascii="Cambria" w:cs="Cambria" w:eastAsia="Cambria" w:hAnsi="Cambria"/>
-          <w:sz w:val="24"/>
-          <w:szCs w:val="24"/>
-          <w:rtl w:val="0"/>
-        </w:rPr>
-        <w:t xml:space="preserve">Juliana Bonilla</w:t>
+      </w:r>
+      <w:r>
+        <w:rPr>
+          <w:rFonts w:ascii="Cambria" w:cs="Cambria" w:eastAsia="Cambria" w:hAnsi="Cambria"/>
+          <w:sz w:val="24"/>
+          <w:szCs w:val="24"/>
+          <w:rtl w:val="0"/>
+        </w:rPr>
       </w:r>
       <w:r>
         <w:rPr>
@@ -12414,7 +12394,6 @@
           <w:szCs w:val="24"/>
           <w:rtl w:val="0"/>
         </w:rPr>
-        <w:t xml:space="preserve">. </w:t>
       </w:r>
       <w:r>
         <w:rPr>
@@ -12425,7 +12404,6 @@
           <w:u w:val="single"/>
           <w:rtl w:val="0"/>
         </w:rPr>
-        <w:t xml:space="preserve">En SICEP deberá cargarse copia de la garantía de seriedad y comprobante de envío del original</w:t>
       </w:r>
       <w:r>
         <w:rPr>
@@ -12435,7 +12413,6 @@
           <w:szCs w:val="24"/>
           <w:rtl w:val="0"/>
         </w:rPr>
-        <w:t xml:space="preserve">.</w:t>
       </w:r>
     </w:p>
     <w:p>

</xml_diff>